<commit_message>
Aktualizacja projektu zalecenia Zasady oceny ofert
</commit_message>
<xml_diff>
--- a/documentation/docs/zaopatrzenie/zasady-oceny-ofert/zasady-oceny-ofert-szablon-wymagan.docx
+++ b/documentation/docs/zaopatrzenie/zasady-oceny-ofert/zasady-oceny-ofert-szablon-wymagan.docx
@@ -134,10 +134,7 @@
           <w:numId w:val="9"/>
         </w:numPr>
         <w:spacing w:before="400"/>
-        <w:ind w:left="357" w:hanging="357"/>
-        <w:rPr>
-          <w:rStyle w:val="Pogrubienie"/>
-        </w:rPr>
+        <w:ind w:hanging="357"/>
       </w:pPr>
       <w:r>
         <w:rPr>
@@ -150,116 +147,82 @@
         <w:rPr>
           <w:rStyle w:val="Pogrubienie"/>
         </w:rPr>
-        <w:t xml:space="preserve">. Dostawca opisze, w jaki sposób zapewni, że oferowane rozwiązanie będzie spełniać i utrzymywać zgodność z kryteriami sukcesu WCAG ujętymi w </w:t>
-      </w:r>
-      <w:hyperlink r:id="rId7" w:tgtFrame="_blank" w:history="1">
+        <w:t xml:space="preserve">. Dostawca opisze, </w:t>
+      </w:r>
+      <w:r>
+        <w:rPr>
+          <w:b/>
+          <w:bCs/>
+        </w:rPr>
+        <w:t xml:space="preserve">w jaki sposób zapewni zgodność oferowanego rozwiązania z wymaganiami normy </w:t>
+      </w:r>
+      <w:hyperlink r:id="rId7" w:history="1">
         <w:r>
           <w:rPr>
             <w:rStyle w:val="Hipercze"/>
             <w:b/>
             <w:bCs/>
           </w:rPr>
-          <w:t>PN-ETSI EN 301 549</w:t>
+          <w:t>P</w:t>
+        </w:r>
+        <w:r>
+          <w:rPr>
+            <w:rStyle w:val="Hipercze"/>
+            <w:b/>
+            <w:bCs/>
+          </w:rPr>
+          <w:t>N</w:t>
+        </w:r>
+        <w:r>
+          <w:rPr>
+            <w:rStyle w:val="Hipercze"/>
+            <w:b/>
+            <w:bCs/>
+          </w:rPr>
+          <w:t>-</w:t>
+        </w:r>
+        <w:r>
+          <w:rPr>
+            <w:rStyle w:val="Hipercze"/>
+            <w:b/>
+            <w:bCs/>
+          </w:rPr>
+          <w:t xml:space="preserve">ETSI </w:t>
+        </w:r>
+        <w:r>
+          <w:rPr>
+            <w:rStyle w:val="Hipercze"/>
+            <w:b/>
+            <w:bCs/>
+          </w:rPr>
+          <w:t xml:space="preserve">EN </w:t>
+        </w:r>
+        <w:r>
+          <w:rPr>
+            <w:rStyle w:val="Hipercze"/>
+            <w:b/>
+            <w:bCs/>
+          </w:rPr>
+          <w:t>301 549</w:t>
         </w:r>
       </w:hyperlink>
       <w:r>
+        <w:rPr>
+          <w:rStyle w:val="Pogrubienie"/>
+          <w:b w:val="0"/>
+          <w:bCs w:val="0"/>
+        </w:rPr>
         <w:t xml:space="preserve"> </w:t>
       </w:r>
       <w:r>
         <w:rPr>
-          <w:rStyle w:val="Pogrubienie"/>
-        </w:rPr>
-        <w:t>zgodnie z przepis</w:t>
-      </w:r>
-      <w:r>
-        <w:rPr>
-          <w:rStyle w:val="Pogrubienie"/>
-        </w:rPr>
-        <w:t>ami</w:t>
-      </w:r>
-      <w:r>
-        <w:rPr>
-          <w:rStyle w:val="Pogrubienie"/>
-        </w:rPr>
-        <w:t xml:space="preserve"> ustawy o dostępności cyfrowej... </w:t>
-      </w:r>
-      <w:r>
-        <w:rPr>
-          <w:rStyle w:val="Pogrubienie"/>
-        </w:rPr>
-        <w:t xml:space="preserve">oraz wymaganiami wykraczającymi ponad ujęte w </w:t>
-      </w:r>
-      <w:r>
-        <w:rPr>
-          <w:rStyle w:val="Pogrubienie"/>
-        </w:rPr>
-        <w:t>PN</w:t>
-      </w:r>
-      <w:r>
-        <w:rPr>
-          <w:rStyle w:val="Pogrubienie"/>
-        </w:rPr>
-        <w:t>-</w:t>
-      </w:r>
-      <w:r>
-        <w:rPr>
-          <w:rStyle w:val="Pogrubienie"/>
-        </w:rPr>
-        <w:t xml:space="preserve">ETSI </w:t>
-      </w:r>
-      <w:r>
-        <w:rPr>
-          <w:rStyle w:val="Pogrubienie"/>
-        </w:rPr>
-        <w:t xml:space="preserve">EN </w:t>
-      </w:r>
-      <w:r>
-        <w:rPr>
-          <w:rStyle w:val="Pogrubienie"/>
-        </w:rPr>
-        <w:t xml:space="preserve">301 549 (np. </w:t>
-      </w:r>
-      <w:r>
-        <w:rPr>
-          <w:rStyle w:val="Pogrubienie"/>
-        </w:rPr>
-        <w:t>niektóre kryteria sukcesu</w:t>
-      </w:r>
-      <w:r>
-        <w:rPr>
-          <w:rStyle w:val="Pogrubienie"/>
-        </w:rPr>
-        <w:t xml:space="preserve"> na</w:t>
-      </w:r>
-      <w:r>
-        <w:rPr>
-          <w:rStyle w:val="Pogrubienie"/>
-        </w:rPr>
-        <w:t> </w:t>
-      </w:r>
-      <w:r>
-        <w:rPr>
-          <w:rStyle w:val="Pogrubienie"/>
-        </w:rPr>
-        <w:t>poziomie WCAG AAA</w:t>
-      </w:r>
-      <w:r>
-        <w:rPr>
-          <w:rStyle w:val="Pogrubienie"/>
-        </w:rPr>
-        <w:t>, dobre praktyki</w:t>
-      </w:r>
-      <w:r>
-        <w:rPr>
-          <w:rStyle w:val="Pogrubienie"/>
-        </w:rPr>
-        <w:t>)</w:t>
-      </w:r>
-      <w:r>
-        <w:rPr>
-          <w:rStyle w:val="Pogrubienie"/>
-        </w:rPr>
-        <w:t xml:space="preserve">. </w:t>
+          <w:b/>
+          <w:bCs/>
+        </w:rPr>
+        <w:t>oraz utrzymanie tej zgodności w całym cyklu życia rozwiązania</w:t>
+      </w:r>
+      <w:r>
+        <w:t>.</w:t>
       </w:r>
     </w:p>
     <w:p>
@@ -350,25 +313,28 @@
           <w:rStyle w:val="Pogrubienie"/>
           <w:color w:val="215E99" w:themeColor="text2" w:themeTint="BF"/>
         </w:rPr>
-        <w:t>W-02. Dostosowanie</w:t>
-      </w:r>
-      <w:r>
-        <w:t xml:space="preserve">. </w:t>
-      </w:r>
-      <w:r>
-        <w:rPr>
-          <w:rStyle w:val="Pogrubienie"/>
-        </w:rPr>
-        <w:t>Dostawca opisze możliwości dostosowania przez nabywcę motywów, graficznego interfejsu użytkownika i funkcjonalności</w:t>
-      </w:r>
-      <w:r>
-        <w:rPr>
-          <w:rStyle w:val="Pogrubienie"/>
-        </w:rPr>
+        <w:t>W-02. Wymagania dodatkowe</w:t>
+      </w:r>
+      <w:r>
+        <w:rPr>
+          <w:rStyle w:val="Pogrubienie"/>
+        </w:rPr>
+        <w:t>. Dodatkowe wymagania mogą obejmować w</w:t>
+      </w:r>
+      <w:r>
+        <w:rPr>
+          <w:rStyle w:val="Pogrubienie"/>
+        </w:rPr>
+        <w:t> </w:t>
+      </w:r>
+      <w:r>
+        <w:rPr>
+          <w:rStyle w:val="Pogrubienie"/>
+        </w:rPr>
+        <w:t>szczególności wybrane kryteria sukcesu WCAG na poziomie AAA oraz inne wymagania określone przez nabywcę</w:t>
+      </w:r>
+      <w:r>
         <w:t>.</w:t>
-      </w:r>
-      <w:r>
-        <w:t xml:space="preserve"> </w:t>
       </w:r>
     </w:p>
     <w:p>
@@ -377,22 +343,7 @@
         <w:ind w:left="360"/>
       </w:pPr>
       <w:r>
-        <w:t>Dostawca określi, jaki wpływ na zgodność z wymogami dostępności mogą mieć dostosowania oraz w jaki sposób dostawca wspiera nabywcę w sprawdzaniu i</w:t>
-      </w:r>
-      <w:r>
-        <w:t> </w:t>
-      </w:r>
-      <w:r>
-        <w:t xml:space="preserve">łagodzeniu zagrożeń związanych z dostępnością </w:t>
-      </w:r>
-      <w:r>
-        <w:t xml:space="preserve">dostosowań </w:t>
-      </w:r>
-      <w:r>
-        <w:t>wprowadzanych podczas procesu wdrażania</w:t>
-      </w:r>
-      <w:r>
-        <w:t xml:space="preserve">. </w:t>
+        <w:t>Dostawca opisze sposób spełnienia dodatkowych wymagań dostępności określonych w dokumentacji zamówienia oraz przedstawi informacje lub dowody potwierdzające możliwość ich spełnienia.</w:t>
       </w:r>
     </w:p>
     <w:p>
@@ -401,37 +352,7 @@
         <w:ind w:left="360"/>
       </w:pPr>
       <w:r>
-        <w:t>Na przykład, czy dostawca przechowuje wytyczne dotyczące sposobu wdrażania zmian w graficznym interfejsie użytkownika lub motywie, aby zachować wymagania dotyczące kolorów lub powiększenia</w:t>
-      </w:r>
-      <w:r>
-        <w:t>.</w:t>
-      </w:r>
-      <w:r>
-        <w:t xml:space="preserve"> </w:t>
-      </w:r>
-      <w:r>
-        <w:t>A</w:t>
-      </w:r>
-      <w:r>
-        <w:t>lbo czy dostawca przechowuje listę</w:t>
-      </w:r>
-      <w:r>
-        <w:t xml:space="preserve"> użytych</w:t>
-      </w:r>
-      <w:r>
-        <w:t xml:space="preserve"> komponentów i ich znane problemy z dostępnością, aby </w:t>
-      </w:r>
-      <w:r>
-        <w:t>nabywca</w:t>
-      </w:r>
-      <w:r>
-        <w:t xml:space="preserve"> m</w:t>
-      </w:r>
-      <w:r>
-        <w:t>ógł</w:t>
-      </w:r>
-      <w:r>
-        <w:t xml:space="preserve"> wybrać przed wdrożeniem tylko dostępne komponenty. </w:t>
+        <w:t>Na przykład może to dotyczyć wybranych kryteriów sukcesu WCAG na poziomie AAA, dodatkowych wymagań dotyczących personalizacji interfejsu użytkownika, rozszerzonego wsparcia technologii wspomagających, wymagań wynikających ze specyfiki usługi lub szczególnych potrzeb użytkowników.</w:t>
       </w:r>
     </w:p>
     <w:p>
@@ -447,7 +368,21 @@
           <w:rStyle w:val="Pogrubienie"/>
           <w:color w:val="215E99" w:themeColor="text2" w:themeTint="BF"/>
         </w:rPr>
-        <w:t>W-03. Tworzenie treści</w:t>
+        <w:t>W-0</w:t>
+      </w:r>
+      <w:r>
+        <w:rPr>
+          <w:rStyle w:val="Pogrubienie"/>
+          <w:color w:val="215E99" w:themeColor="text2" w:themeTint="BF"/>
+        </w:rPr>
+        <w:t>3</w:t>
+      </w:r>
+      <w:r>
+        <w:rPr>
+          <w:rStyle w:val="Pogrubienie"/>
+          <w:color w:val="215E99" w:themeColor="text2" w:themeTint="BF"/>
+        </w:rPr>
+        <w:t>. Dostosowanie</w:t>
       </w:r>
       <w:r>
         <w:t xml:space="preserve">. </w:t>
@@ -456,22 +391,16 @@
         <w:rPr>
           <w:rStyle w:val="Pogrubienie"/>
         </w:rPr>
-        <w:t xml:space="preserve">Dostawca opisze, w jaki sposób rozwiązanie wspiera tworzenie dostępnych treści </w:t>
-      </w:r>
-      <w:r>
-        <w:rPr>
-          <w:rStyle w:val="Pogrubienie"/>
-        </w:rPr>
-        <w:t>cyfrowych</w:t>
-      </w:r>
-      <w:r>
-        <w:rPr>
-          <w:rStyle w:val="Pogrubienie"/>
-        </w:rPr>
-        <w:t xml:space="preserve"> i zapewnia ich zgodność z WCAG</w:t>
-      </w:r>
-      <w:r>
-        <w:t xml:space="preserve">. </w:t>
+        <w:t>Dostawca opisze możliwości dostosowania przez nabywcę motywów, graficznego interfejsu użytkownika i funkcjonalności</w:t>
+      </w:r>
+      <w:r>
+        <w:rPr>
+          <w:rStyle w:val="Pogrubienie"/>
+        </w:rPr>
+        <w:t>.</w:t>
+      </w:r>
+      <w:r>
+        <w:t xml:space="preserve"> </w:t>
       </w:r>
     </w:p>
     <w:p>
@@ -480,19 +409,61 @@
         <w:ind w:left="360"/>
       </w:pPr>
       <w:r>
-        <w:t>Na przykład, czy i jakie mechanizmy</w:t>
+        <w:t>Dostawca określi, jaki wpływ na zgodność z wymogami dostępności mogą mieć dostosowania oraz w jaki sposób dostawca wspiera nabywcę w sprawdzaniu i</w:t>
+      </w:r>
+      <w:r>
+        <w:t> </w:t>
+      </w:r>
+      <w:r>
+        <w:t xml:space="preserve">łagodzeniu zagrożeń związanych z dostępnością </w:t>
+      </w:r>
+      <w:r>
+        <w:t xml:space="preserve">dostosowań </w:t>
+      </w:r>
+      <w:r>
+        <w:t>wprowadzanych podczas procesu wdrażania</w:t>
+      </w:r>
+      <w:r>
+        <w:t xml:space="preserve">. </w:t>
+      </w:r>
+    </w:p>
+    <w:p>
+      <w:pPr>
+        <w:pStyle w:val="Akapitzlist"/>
+        <w:ind w:left="360"/>
+      </w:pPr>
+      <w:r>
+        <w:t>Na przykład, czy dostawca przechowuje wytyczne dotyczące sposobu wdrażania zmian w graficznym interfejsie użytkownika lub motywie, aby zachować wymagania dotyczące kolorów lub powiększenia</w:t>
+      </w:r>
+      <w:r>
+        <w:t>.</w:t>
       </w:r>
       <w:r>
         <w:t xml:space="preserve"> </w:t>
       </w:r>
       <w:r>
-        <w:t xml:space="preserve">lub wskazówki zawiera rozwiązanie, aby pomóc twórcom treści w przesyłaniu lub pisaniu dostępnych treści internetowych, takie jak </w:t>
-      </w:r>
-      <w:r>
-        <w:t>wbudowane</w:t>
-      </w:r>
-      <w:r>
-        <w:t xml:space="preserve"> testy struktury nagłówków, obecności tekstów alternatywnych, itp. </w:t>
+        <w:t>A</w:t>
+      </w:r>
+      <w:r>
+        <w:t>lbo czy dostawca przechowuje listę</w:t>
+      </w:r>
+      <w:r>
+        <w:t xml:space="preserve"> użytych</w:t>
+      </w:r>
+      <w:r>
+        <w:t xml:space="preserve"> komponentów i ich znane problemy z dostępnością, aby </w:t>
+      </w:r>
+      <w:r>
+        <w:t>nabywca</w:t>
+      </w:r>
+      <w:r>
+        <w:t xml:space="preserve"> m</w:t>
+      </w:r>
+      <w:r>
+        <w:t>ógł</w:t>
+      </w:r>
+      <w:r>
+        <w:t xml:space="preserve"> wybrać przed wdrożeniem tylko dostępne komponenty. </w:t>
       </w:r>
     </w:p>
     <w:p>
@@ -502,29 +473,112 @@
           <w:ilvl w:val="0"/>
           <w:numId w:val="9"/>
         </w:numPr>
-        <w:rPr>
-          <w:rStyle w:val="Pogrubienie"/>
-        </w:rPr>
       </w:pPr>
       <w:r>
         <w:rPr>
           <w:rStyle w:val="Pogrubienie"/>
           <w:color w:val="215E99" w:themeColor="text2" w:themeTint="BF"/>
         </w:rPr>
-        <w:t>W-04. Narzędzia dla pracowników</w:t>
-      </w:r>
-      <w:r>
-        <w:rPr>
-          <w:rStyle w:val="Pogrubienie"/>
-        </w:rPr>
-        <w:t xml:space="preserve">. Dostawca opisze, w jaki sposób rozwiązanie wspiera pracowników z niepełnosprawnościami w korzystaniu z narzędzi do </w:t>
-      </w:r>
-      <w:r>
-        <w:rPr>
-          <w:rStyle w:val="Pogrubienie"/>
-        </w:rPr>
         <w:lastRenderedPageBreak/>
-        <w:t>tworzenia treści, zgodnie z wytycznymi ATAG (</w:t>
+        <w:t>W-0</w:t>
+      </w:r>
+      <w:r>
+        <w:rPr>
+          <w:rStyle w:val="Pogrubienie"/>
+          <w:color w:val="215E99" w:themeColor="text2" w:themeTint="BF"/>
+        </w:rPr>
+        <w:t>4</w:t>
+      </w:r>
+      <w:r>
+        <w:rPr>
+          <w:rStyle w:val="Pogrubienie"/>
+          <w:color w:val="215E99" w:themeColor="text2" w:themeTint="BF"/>
+        </w:rPr>
+        <w:t>. Tworzenie treści</w:t>
+      </w:r>
+      <w:r>
+        <w:t xml:space="preserve">. </w:t>
+      </w:r>
+      <w:r>
+        <w:rPr>
+          <w:rStyle w:val="Pogrubienie"/>
+        </w:rPr>
+        <w:t xml:space="preserve">Dostawca opisze, w jaki sposób rozwiązanie wspiera tworzenie dostępnych treści </w:t>
+      </w:r>
+      <w:r>
+        <w:rPr>
+          <w:rStyle w:val="Pogrubienie"/>
+        </w:rPr>
+        <w:t>cyfrowych</w:t>
+      </w:r>
+      <w:r>
+        <w:rPr>
+          <w:rStyle w:val="Pogrubienie"/>
+        </w:rPr>
+        <w:t xml:space="preserve"> i zapewnia ich zgodność z WCAG</w:t>
+      </w:r>
+      <w:r>
+        <w:t xml:space="preserve">. </w:t>
+      </w:r>
+    </w:p>
+    <w:p>
+      <w:pPr>
+        <w:pStyle w:val="Akapitzlist"/>
+        <w:ind w:left="360"/>
+      </w:pPr>
+      <w:r>
+        <w:t>Na przykład, czy i jakie mechanizmy</w:t>
+      </w:r>
+      <w:r>
+        <w:t xml:space="preserve"> </w:t>
+      </w:r>
+      <w:r>
+        <w:t xml:space="preserve">lub wskazówki zawiera rozwiązanie, aby pomóc twórcom treści w przesyłaniu lub pisaniu dostępnych treści internetowych, takie jak </w:t>
+      </w:r>
+      <w:r>
+        <w:t>wbudowane</w:t>
+      </w:r>
+      <w:r>
+        <w:t xml:space="preserve"> testy struktury nagłówków, obecności tekstów alternatywnych, itp. </w:t>
+      </w:r>
+    </w:p>
+    <w:p>
+      <w:pPr>
+        <w:pStyle w:val="Akapitzlist"/>
+        <w:numPr>
+          <w:ilvl w:val="0"/>
+          <w:numId w:val="9"/>
+        </w:numPr>
+        <w:rPr>
+          <w:rStyle w:val="Pogrubienie"/>
+        </w:rPr>
+      </w:pPr>
+      <w:r>
+        <w:rPr>
+          <w:rStyle w:val="Pogrubienie"/>
+          <w:color w:val="215E99" w:themeColor="text2" w:themeTint="BF"/>
+        </w:rPr>
+        <w:t>W-0</w:t>
+      </w:r>
+      <w:r>
+        <w:rPr>
+          <w:rStyle w:val="Pogrubienie"/>
+          <w:color w:val="215E99" w:themeColor="text2" w:themeTint="BF"/>
+        </w:rPr>
+        <w:t>5</w:t>
+      </w:r>
+      <w:r>
+        <w:rPr>
+          <w:rStyle w:val="Pogrubienie"/>
+          <w:color w:val="215E99" w:themeColor="text2" w:themeTint="BF"/>
+        </w:rPr>
+        <w:t>. Narzędzia dla pracowników</w:t>
+      </w:r>
+      <w:r>
+        <w:rPr>
+          <w:rStyle w:val="Pogrubienie"/>
+        </w:rPr>
+        <w:t>. Dostawca opisze, w jaki sposób rozwiązanie wspiera pracowników z niepełnosprawnościami w korzystaniu z narzędzi do tworzenia treści, zgodnie z wytycznymi ATAG (</w:t>
       </w:r>
       <w:hyperlink r:id="rId8" w:history="1">
         <w:r>
@@ -533,7 +587,25 @@
             <w:b/>
             <w:bCs/>
           </w:rPr>
-          <w:t>Authoring Tools Accessibility Guidelines 2.0</w:t>
+          <w:t xml:space="preserve">Authoring Tools Accessibility </w:t>
+        </w:r>
+        <w:proofErr w:type="spellStart"/>
+        <w:r>
+          <w:rPr>
+            <w:rStyle w:val="Hipercze"/>
+            <w:b/>
+            <w:bCs/>
+          </w:rPr>
+          <w:t>Guidelines</w:t>
+        </w:r>
+        <w:proofErr w:type="spellEnd"/>
+        <w:r>
+          <w:rPr>
+            <w:rStyle w:val="Hipercze"/>
+            <w:b/>
+            <w:bCs/>
+          </w:rPr>
+          <w:t xml:space="preserve"> 2.0</w:t>
         </w:r>
       </w:hyperlink>
       <w:r>
@@ -583,7 +655,21 @@
           <w:rStyle w:val="Pogrubienie"/>
           <w:color w:val="215E99" w:themeColor="text2" w:themeTint="BF"/>
         </w:rPr>
-        <w:t>W-05. Nakładki</w:t>
+        <w:t>W-0</w:t>
+      </w:r>
+      <w:r>
+        <w:rPr>
+          <w:rStyle w:val="Pogrubienie"/>
+          <w:color w:val="215E99" w:themeColor="text2" w:themeTint="BF"/>
+        </w:rPr>
+        <w:t>6</w:t>
+      </w:r>
+      <w:r>
+        <w:rPr>
+          <w:rStyle w:val="Pogrubienie"/>
+          <w:color w:val="215E99" w:themeColor="text2" w:themeTint="BF"/>
+        </w:rPr>
+        <w:t>. Nakładki</w:t>
       </w:r>
       <w:r>
         <w:t xml:space="preserve">. </w:t>
@@ -595,13 +681,47 @@
         <w:t xml:space="preserve">Dostawca wskaże, czy w dostarczanym rozwiązaniu korzysta lub planuje korzystać z jakichkolwiek produktów dostarczonych przez firmy wymienione w arkuszu </w:t>
       </w:r>
       <w:hyperlink r:id="rId9" w:anchor="main" w:tgtFrame="_blank" w:history="1">
+        <w:proofErr w:type="spellStart"/>
         <w:r>
           <w:rPr>
             <w:rStyle w:val="Pogrubienie"/>
             <w:color w:val="215E99" w:themeColor="text2" w:themeTint="BF"/>
           </w:rPr>
-          <w:t>Overlay Fact Sheet</w:t>
+          <w:t>Overlay</w:t>
         </w:r>
+        <w:proofErr w:type="spellEnd"/>
+        <w:r>
+          <w:rPr>
+            <w:rStyle w:val="Pogrubienie"/>
+            <w:color w:val="215E99" w:themeColor="text2" w:themeTint="BF"/>
+          </w:rPr>
+          <w:t xml:space="preserve"> </w:t>
+        </w:r>
+        <w:proofErr w:type="spellStart"/>
+        <w:r>
+          <w:rPr>
+            <w:rStyle w:val="Pogrubienie"/>
+            <w:color w:val="215E99" w:themeColor="text2" w:themeTint="BF"/>
+          </w:rPr>
+          <w:t>Fact</w:t>
+        </w:r>
+        <w:proofErr w:type="spellEnd"/>
+        <w:r>
+          <w:rPr>
+            <w:rStyle w:val="Pogrubienie"/>
+            <w:color w:val="215E99" w:themeColor="text2" w:themeTint="BF"/>
+          </w:rPr>
+          <w:t xml:space="preserve"> </w:t>
+        </w:r>
+        <w:proofErr w:type="spellStart"/>
+        <w:r>
+          <w:rPr>
+            <w:rStyle w:val="Pogrubienie"/>
+            <w:color w:val="215E99" w:themeColor="text2" w:themeTint="BF"/>
+          </w:rPr>
+          <w:t>Sheet</w:t>
+        </w:r>
+        <w:proofErr w:type="spellEnd"/>
       </w:hyperlink>
       <w:r>
         <w:rPr>
@@ -640,7 +760,23 @@
         <w:t>)</w:t>
       </w:r>
       <w:r>
-        <w:t xml:space="preserve"> Overlay i Underlay, które oferują naprawę problemów z</w:t>
+        <w:t xml:space="preserve"> </w:t>
+      </w:r>
+      <w:proofErr w:type="spellStart"/>
+      <w:r>
+        <w:t>Overlay</w:t>
+      </w:r>
+      <w:proofErr w:type="spellEnd"/>
+      <w:r>
+        <w:t xml:space="preserve"> i </w:t>
+      </w:r>
+      <w:proofErr w:type="spellStart"/>
+      <w:r>
+        <w:t>Underlay</w:t>
+      </w:r>
+      <w:proofErr w:type="spellEnd"/>
+      <w:r>
+        <w:t>, które oferują naprawę problemów z</w:t>
       </w:r>
       <w:r>
         <w:t> </w:t>
@@ -658,7 +794,15 @@
         <w:t>oraz</w:t>
       </w:r>
       <w:r>
-        <w:t xml:space="preserve"> reputacyjne zarówno dla dostawcy, jak i</w:t>
+        <w:t xml:space="preserve"> </w:t>
+      </w:r>
+      <w:proofErr w:type="spellStart"/>
+      <w:r>
+        <w:t>reputacyjne</w:t>
+      </w:r>
+      <w:proofErr w:type="spellEnd"/>
+      <w:r>
+        <w:t xml:space="preserve"> zarówno dla dostawcy, jak i</w:t>
       </w:r>
       <w:r>
         <w:t> </w:t>
@@ -692,7 +836,21 @@
           <w:rStyle w:val="Pogrubienie"/>
           <w:color w:val="215E99" w:themeColor="text2" w:themeTint="BF"/>
         </w:rPr>
-        <w:t>W-06. Deklaracja</w:t>
+        <w:t>W-0</w:t>
+      </w:r>
+      <w:r>
+        <w:rPr>
+          <w:rStyle w:val="Pogrubienie"/>
+          <w:color w:val="215E99" w:themeColor="text2" w:themeTint="BF"/>
+        </w:rPr>
+        <w:t>7</w:t>
+      </w:r>
+      <w:r>
+        <w:rPr>
+          <w:rStyle w:val="Pogrubienie"/>
+          <w:color w:val="215E99" w:themeColor="text2" w:themeTint="BF"/>
+        </w:rPr>
+        <w:t>. Deklaracja</w:t>
       </w:r>
       <w:r>
         <w:rPr>
@@ -750,7 +908,28 @@
           <w:rStyle w:val="Pogrubienie"/>
           <w:color w:val="215E99" w:themeColor="text2" w:themeTint="BF"/>
         </w:rPr>
-        <w:t>W-07. Wskazówki</w:t>
+        <w:t>W-0</w:t>
+      </w:r>
+      <w:r>
+        <w:rPr>
+          <w:rStyle w:val="Pogrubienie"/>
+          <w:color w:val="215E99" w:themeColor="text2" w:themeTint="BF"/>
+        </w:rPr>
+        <w:t>8</w:t>
+      </w:r>
+      <w:r>
+        <w:rPr>
+          <w:rStyle w:val="Pogrubienie"/>
+          <w:color w:val="215E99" w:themeColor="text2" w:themeTint="BF"/>
+        </w:rPr>
+        <w:t xml:space="preserve">. </w:t>
+      </w:r>
+      <w:r>
+        <w:rPr>
+          <w:rStyle w:val="Pogrubienie"/>
+          <w:color w:val="215E99" w:themeColor="text2" w:themeTint="BF"/>
+        </w:rPr>
+        <w:t>Wskazówki dla użytkowników technologii wspomagających</w:t>
       </w:r>
       <w:r>
         <w:rPr>
@@ -850,6 +1029,24 @@
       </w:r>
       <w:r>
         <w:t>. </w:t>
+      </w:r>
+    </w:p>
+    <w:p>
+      <w:pPr>
+        <w:pStyle w:val="Akapitzlist"/>
+        <w:ind w:left="360"/>
+      </w:pPr>
+      <w:r>
+        <w:t>Dostawca opisze, jakie informacje, instrukcje lub materiały pomocnicze są lub będą dostępne dla użytkowników technologii wspomagających oraz w jaki sposób będą one utrzymywane w aktualności.</w:t>
+      </w:r>
+    </w:p>
+    <w:p>
+      <w:pPr>
+        <w:pStyle w:val="Akapitzlist"/>
+        <w:ind w:left="360"/>
+      </w:pPr>
+      <w:r>
+        <w:t>Na przykład mogą to być instrukcje korzystania z rozwiązania przy użyciu czytników ekranu, oprogramowania powiększającego, sterowania głosowego lub innych technologii wspomagających, a także informacje o znanych ograniczeniach dostępności i sposobach ich obejścia.</w:t>
       </w:r>
     </w:p>
     <w:p>
@@ -868,6 +1065,7 @@
           <w:rStyle w:val="Pogrubienie"/>
           <w:color w:val="215E99" w:themeColor="text2" w:themeTint="BF"/>
         </w:rPr>
+        <w:lastRenderedPageBreak/>
         <w:t>W-08. Dokumenty</w:t>
       </w:r>
       <w:r>
@@ -922,8 +1120,110 @@
       </w:r>
     </w:p>
     <w:p>
-      <w:r>
-        <w:t>Wersja 1.0, 20 września 2025</w:t>
+      <w:pPr>
+        <w:pStyle w:val="Akapitzlist"/>
+        <w:numPr>
+          <w:ilvl w:val="0"/>
+          <w:numId w:val="9"/>
+        </w:numPr>
+      </w:pPr>
+      <w:r>
+        <w:rPr>
+          <w:rStyle w:val="Pogrubienie"/>
+          <w:color w:val="215E99" w:themeColor="text2" w:themeTint="BF"/>
+        </w:rPr>
+        <w:t>W-10. Komponenty stron trzecich</w:t>
+      </w:r>
+      <w:r>
+        <w:rPr>
+          <w:rStyle w:val="Pogrubienie"/>
+        </w:rPr>
+        <w:t>. Dostawca opisze dostępność komponentów i usług stron trzecich stanowiących część oferowanego rozwiązania oraz sposób zarządzania ryzykiem związanym z ich dostępnością</w:t>
+      </w:r>
+      <w:r>
+        <w:t>.</w:t>
+      </w:r>
+    </w:p>
+    <w:p>
+      <w:pPr>
+        <w:pStyle w:val="Akapitzlist"/>
+        <w:ind w:left="360"/>
+      </w:pPr>
+      <w:r>
+        <w:t xml:space="preserve">Dostawca określi, które elementy rozwiązania są dostarczane przez podmioty trzecie, jaki jest ich wpływ na dostępność całego rozwiązania oraz jakie informacje lub dowody dostępności są dostępne dla tych komponentów. </w:t>
+      </w:r>
+    </w:p>
+    <w:p>
+      <w:pPr>
+        <w:pStyle w:val="Akapitzlist"/>
+        <w:ind w:left="360"/>
+      </w:pPr>
+      <w:r>
+        <w:t>Na przykład mogą to być moduły płatności elektronicznych, podpisu elektronicznego, map, komunikacji wideo, systemów uwierzytelniania, usług chmurowych lub innych usług integrowanych z rozwiązaniem. Dostawca powinien również opisać sposób postępowania w przypadku stwierdzenia problemów dostępności takich komponentów.</w:t>
+      </w:r>
+    </w:p>
+    <w:p>
+      <w:pPr>
+        <w:pStyle w:val="Akapitzlist"/>
+        <w:numPr>
+          <w:ilvl w:val="0"/>
+          <w:numId w:val="9"/>
+        </w:numPr>
+      </w:pPr>
+      <w:r>
+        <w:rPr>
+          <w:rStyle w:val="Pogrubienie"/>
+          <w:color w:val="215E99" w:themeColor="text2" w:themeTint="BF"/>
+        </w:rPr>
+        <w:t>W-11. Utrzymanie dostępności</w:t>
+      </w:r>
+      <w:r>
+        <w:rPr>
+          <w:rStyle w:val="Pogrubienie"/>
+        </w:rPr>
+        <w:t>. Dostawca opisze sposób utrzymywania dostępności rozwiązania po wdrożeniu, w tym proces zgłaszania, analizowania i usuwania problemów dostępności cyfrowej oraz sposób informowania nabywcy o zmianach mających wpływ na dostępność rozwiązania</w:t>
+      </w:r>
+      <w:r>
+        <w:t>.</w:t>
+      </w:r>
+    </w:p>
+    <w:p>
+      <w:pPr>
+        <w:pStyle w:val="Akapitzlist"/>
+        <w:ind w:left="360"/>
+      </w:pPr>
+      <w:r>
+        <w:t xml:space="preserve">Dostawca określi sposób monitorowania dostępności rozwiązania, obsługi zgłoszeń dotyczących problemów dostępności oraz utrzymywania zgodności podczas aktualizacji, rozwoju i utrzymania rozwiązania. </w:t>
+      </w:r>
+    </w:p>
+    <w:p>
+      <w:pPr>
+        <w:pStyle w:val="Akapitzlist"/>
+        <w:ind w:left="360"/>
+      </w:pPr>
+      <w:r>
+        <w:t>Na przykład dostawca może przedstawić procedurę obsługi zgłoszeń, deklarowane czasy reakcji i usuwania błędów dostępności, sposób dokumentowania zmian wpływających na dostępność oraz zakres testów wykonywanych przed wdrożeniem nowych wersji rozwiązania.</w:t>
+      </w:r>
+    </w:p>
+    <w:p/>
+    <w:p>
+      <w:r>
+        <w:t>Wersja 1.</w:t>
+      </w:r>
+      <w:r>
+        <w:t>1</w:t>
+      </w:r>
+      <w:r>
+        <w:t xml:space="preserve">, </w:t>
+      </w:r>
+      <w:r>
+        <w:t>24 czerwca</w:t>
+      </w:r>
+      <w:r>
+        <w:t xml:space="preserve"> 20</w:t>
+      </w:r>
+      <w:r>
+        <w:t>26</w:t>
       </w:r>
       <w:r>
         <w:t xml:space="preserve"> </w:t>
@@ -945,6 +1245,92 @@
 <file path=word/numbering.xml><?xml version="1.0" encoding="utf-8"?>
 <w:numbering xmlns:wpc="http://schemas.microsoft.com/office/word/2010/wordprocessingCanvas" xmlns:cx="http://schemas.microsoft.com/office/drawing/2014/chartex" xmlns:cx1="http://schemas.microsoft.com/office/drawing/2015/9/8/chartex" xmlns:cx2="http://schemas.microsoft.com/office/drawing/2015/10/21/chartex" xmlns:cx3="http://schemas.microsoft.com/office/drawing/2016/5/9/chartex" xmlns:cx4="http://schemas.microsoft.com/office/drawing/2016/5/10/chartex" xmlns:cx5="http://schemas.microsoft.com/office/drawing/2016/5/11/chartex" xmlns:cx6="http://schemas.microsoft.com/office/drawing/2016/5/12/chartex" xmlns:cx7="http://schemas.microsoft.com/office/drawing/2016/5/13/chartex" xmlns:cx8="http://schemas.microsoft.com/office/drawing/2016/5/14/chartex" xmlns:mc="http://schemas.openxmlformats.org/markup-compatibility/2006" xmlns:aink="http://schemas.microsoft.com/office/drawing/2016/ink" xmlns:am3d="http://schemas.microsoft.com/office/drawing/2017/model3d" xmlns:o="urn:schemas-microsoft-com:office:office" xmlns:oel="http://schemas.microsoft.com/office/2019/extlst" xmlns:r="http://schemas.openxmlformats.org/officeDocument/2006/relationships" xmlns:m="http://schemas.openxmlformats.org/officeDocument/2006/math" xmlns:v="urn:schemas-microsoft-com:vml" xmlns:wp14="http://schemas.microsoft.com/office/word/2010/wordprocessingDrawing" xmlns:wp="http://schemas.openxmlformats.org/drawingml/2006/wordprocessingDrawing" xmlns:w10="urn:schemas-microsoft-com:office:word" xmlns:w="http://schemas.openxmlformats.org/wordprocessingml/2006/main" xmlns:w14="http://schemas.microsoft.com/office/word/2010/wordml" xmlns:w15="http://schemas.microsoft.com/office/word/2012/wordml" xmlns:w16cex="http://schemas.microsoft.com/office/word/2018/wordml/cex" xmlns:w16cid="http://schemas.microsoft.com/office/word/2016/wordml/cid" xmlns:w16="http://schemas.microsoft.com/office/word/2018/wordml" xmlns:w16du="http://schemas.microsoft.com/office/word/2023/wordml/word16du" xmlns:w16sdtdh="http://schemas.microsoft.com/office/word/2020/wordml/sdtdatahash" xmlns:w16sdtfl="http://schemas.microsoft.com/office/word/2024/wordml/sdtformatlock" xmlns:w16se="http://schemas.microsoft.com/office/word/2015/wordml/symex" xmlns:wpg="http://schemas.microsoft.com/office/word/2010/wordprocessingGroup" xmlns:wpi="http://schemas.microsoft.com/office/word/2010/wordprocessingInk" xmlns:wne="http://schemas.microsoft.com/office/word/2006/wordml" xmlns:wps="http://schemas.microsoft.com/office/word/2010/wordprocessingShape" mc:Ignorable="w14 w15 w16se w16cid w16 w16cex w16sdtdh w16sdtfl w16du wp14">
   <w:abstractNum w:abstractNumId="0" w15:restartNumberingAfterBreak="0">
+    <w:nsid w:val="02D71BA5"/>
+    <w:multiLevelType w:val="hybridMultilevel"/>
+    <w:tmpl w:val="788C3690"/>
+    <w:lvl w:ilvl="0" w:tplc="0415000F">
+      <w:start w:val="1"/>
+      <w:numFmt w:val="decimal"/>
+      <w:lvlText w:val="%1."/>
+      <w:lvlJc w:val="left"/>
+      <w:pPr>
+        <w:ind w:left="360" w:hanging="360"/>
+      </w:pPr>
+    </w:lvl>
+    <w:lvl w:ilvl="1" w:tplc="04150019" w:tentative="1">
+      <w:start w:val="1"/>
+      <w:numFmt w:val="lowerLetter"/>
+      <w:lvlText w:val="%2."/>
+      <w:lvlJc w:val="left"/>
+      <w:pPr>
+        <w:ind w:left="1080" w:hanging="360"/>
+      </w:pPr>
+    </w:lvl>
+    <w:lvl w:ilvl="2" w:tplc="0415001B" w:tentative="1">
+      <w:start w:val="1"/>
+      <w:numFmt w:val="lowerRoman"/>
+      <w:lvlText w:val="%3."/>
+      <w:lvlJc w:val="right"/>
+      <w:pPr>
+        <w:ind w:left="1800" w:hanging="180"/>
+      </w:pPr>
+    </w:lvl>
+    <w:lvl w:ilvl="3" w:tplc="0415000F" w:tentative="1">
+      <w:start w:val="1"/>
+      <w:numFmt w:val="decimal"/>
+      <w:lvlText w:val="%4."/>
+      <w:lvlJc w:val="left"/>
+      <w:pPr>
+        <w:ind w:left="2520" w:hanging="360"/>
+      </w:pPr>
+    </w:lvl>
+    <w:lvl w:ilvl="4" w:tplc="04150019" w:tentative="1">
+      <w:start w:val="1"/>
+      <w:numFmt w:val="lowerLetter"/>
+      <w:lvlText w:val="%5."/>
+      <w:lvlJc w:val="left"/>
+      <w:pPr>
+        <w:ind w:left="3240" w:hanging="360"/>
+      </w:pPr>
+    </w:lvl>
+    <w:lvl w:ilvl="5" w:tplc="0415001B" w:tentative="1">
+      <w:start w:val="1"/>
+      <w:numFmt w:val="lowerRoman"/>
+      <w:lvlText w:val="%6."/>
+      <w:lvlJc w:val="right"/>
+      <w:pPr>
+        <w:ind w:left="3960" w:hanging="180"/>
+      </w:pPr>
+    </w:lvl>
+    <w:lvl w:ilvl="6" w:tplc="0415000F" w:tentative="1">
+      <w:start w:val="1"/>
+      <w:numFmt w:val="decimal"/>
+      <w:lvlText w:val="%7."/>
+      <w:lvlJc w:val="left"/>
+      <w:pPr>
+        <w:ind w:left="4680" w:hanging="360"/>
+      </w:pPr>
+    </w:lvl>
+    <w:lvl w:ilvl="7" w:tplc="04150019" w:tentative="1">
+      <w:start w:val="1"/>
+      <w:numFmt w:val="lowerLetter"/>
+      <w:lvlText w:val="%8."/>
+      <w:lvlJc w:val="left"/>
+      <w:pPr>
+        <w:ind w:left="5400" w:hanging="360"/>
+      </w:pPr>
+    </w:lvl>
+    <w:lvl w:ilvl="8" w:tplc="0415001B" w:tentative="1">
+      <w:start w:val="1"/>
+      <w:numFmt w:val="lowerRoman"/>
+      <w:lvlText w:val="%9."/>
+      <w:lvlJc w:val="right"/>
+      <w:pPr>
+        <w:ind w:left="6120" w:hanging="180"/>
+      </w:pPr>
+    </w:lvl>
+  </w:abstractNum>
+  <w:abstractNum w:abstractNumId="1" w15:restartNumberingAfterBreak="0">
     <w:nsid w:val="13901F6F"/>
     <w:multiLevelType w:val="multilevel"/>
     <w:tmpl w:val="58FE7744"/>
@@ -1057,7 +1443,7 @@
       </w:pPr>
     </w:lvl>
   </w:abstractNum>
-  <w:abstractNum w:abstractNumId="1" w15:restartNumberingAfterBreak="0">
+  <w:abstractNum w:abstractNumId="2" w15:restartNumberingAfterBreak="0">
     <w:nsid w:val="22D91A2D"/>
     <w:multiLevelType w:val="multilevel"/>
     <w:tmpl w:val="F2006D6C"/>
@@ -1170,7 +1556,7 @@
       </w:pPr>
     </w:lvl>
   </w:abstractNum>
-  <w:abstractNum w:abstractNumId="2" w15:restartNumberingAfterBreak="0">
+  <w:abstractNum w:abstractNumId="3" w15:restartNumberingAfterBreak="0">
     <w:nsid w:val="43537B60"/>
     <w:multiLevelType w:val="multilevel"/>
     <w:tmpl w:val="C0A06BE4"/>
@@ -1283,7 +1669,7 @@
       </w:pPr>
     </w:lvl>
   </w:abstractNum>
-  <w:abstractNum w:abstractNumId="3" w15:restartNumberingAfterBreak="0">
+  <w:abstractNum w:abstractNumId="4" w15:restartNumberingAfterBreak="0">
     <w:nsid w:val="519217A8"/>
     <w:multiLevelType w:val="multilevel"/>
     <w:tmpl w:val="75F2308C"/>
@@ -1396,7 +1782,7 @@
       </w:pPr>
     </w:lvl>
   </w:abstractNum>
-  <w:abstractNum w:abstractNumId="4" w15:restartNumberingAfterBreak="0">
+  <w:abstractNum w:abstractNumId="5" w15:restartNumberingAfterBreak="0">
     <w:nsid w:val="5EAA689A"/>
     <w:multiLevelType w:val="multilevel"/>
     <w:tmpl w:val="3C6C7E76"/>
@@ -1509,7 +1895,7 @@
       </w:pPr>
     </w:lvl>
   </w:abstractNum>
-  <w:abstractNum w:abstractNumId="5" w15:restartNumberingAfterBreak="0">
+  <w:abstractNum w:abstractNumId="6" w15:restartNumberingAfterBreak="0">
     <w:nsid w:val="5EAE16CC"/>
     <w:multiLevelType w:val="multilevel"/>
     <w:tmpl w:val="945C1710"/>
@@ -1622,7 +2008,7 @@
       </w:pPr>
     </w:lvl>
   </w:abstractNum>
-  <w:abstractNum w:abstractNumId="6" w15:restartNumberingAfterBreak="0">
+  <w:abstractNum w:abstractNumId="7" w15:restartNumberingAfterBreak="0">
     <w:nsid w:val="62CA2B42"/>
     <w:multiLevelType w:val="multilevel"/>
     <w:tmpl w:val="9F7CD062"/>
@@ -1735,7 +2121,7 @@
       </w:rPr>
     </w:lvl>
   </w:abstractNum>
-  <w:abstractNum w:abstractNumId="7" w15:restartNumberingAfterBreak="0">
+  <w:abstractNum w:abstractNumId="8" w15:restartNumberingAfterBreak="0">
     <w:nsid w:val="6F6844F9"/>
     <w:multiLevelType w:val="multilevel"/>
     <w:tmpl w:val="8AF69BA8"/>
@@ -1848,7 +2234,7 @@
       </w:pPr>
     </w:lvl>
   </w:abstractNum>
-  <w:abstractNum w:abstractNumId="8" w15:restartNumberingAfterBreak="0">
+  <w:abstractNum w:abstractNumId="9" w15:restartNumberingAfterBreak="0">
     <w:nsid w:val="7A206213"/>
     <w:multiLevelType w:val="multilevel"/>
     <w:tmpl w:val="68FAB0D6"/>
@@ -1962,31 +2348,34 @@
     </w:lvl>
   </w:abstractNum>
   <w:num w:numId="1" w16cid:durableId="1733892192">
+    <w:abstractNumId w:val="4"/>
+  </w:num>
+  <w:num w:numId="2" w16cid:durableId="82067894">
+    <w:abstractNumId w:val="5"/>
+  </w:num>
+  <w:num w:numId="3" w16cid:durableId="294410836">
+    <w:abstractNumId w:val="2"/>
+  </w:num>
+  <w:num w:numId="4" w16cid:durableId="2139759483">
+    <w:abstractNumId w:val="1"/>
+  </w:num>
+  <w:num w:numId="5" w16cid:durableId="2082173405">
+    <w:abstractNumId w:val="8"/>
+  </w:num>
+  <w:num w:numId="6" w16cid:durableId="996954802">
+    <w:abstractNumId w:val="9"/>
+  </w:num>
+  <w:num w:numId="7" w16cid:durableId="1252395507">
     <w:abstractNumId w:val="3"/>
   </w:num>
-  <w:num w:numId="2" w16cid:durableId="82067894">
-    <w:abstractNumId w:val="4"/>
+  <w:num w:numId="8" w16cid:durableId="554313028">
+    <w:abstractNumId w:val="6"/>
   </w:num>
-  <w:num w:numId="3" w16cid:durableId="294410836">
-    <w:abstractNumId w:val="1"/>
-  </w:num>
-  <w:num w:numId="4" w16cid:durableId="2139759483">
-    <w:abstractNumId w:val="0"/>
-  </w:num>
-  <w:num w:numId="5" w16cid:durableId="2082173405">
+  <w:num w:numId="9" w16cid:durableId="1781414407">
     <w:abstractNumId w:val="7"/>
   </w:num>
-  <w:num w:numId="6" w16cid:durableId="996954802">
-    <w:abstractNumId w:val="8"/>
-  </w:num>
-  <w:num w:numId="7" w16cid:durableId="1252395507">
-    <w:abstractNumId w:val="2"/>
-  </w:num>
-  <w:num w:numId="8" w16cid:durableId="554313028">
-    <w:abstractNumId w:val="5"/>
-  </w:num>
-  <w:num w:numId="9" w16cid:durableId="1781414407">
-    <w:abstractNumId w:val="6"/>
+  <w:num w:numId="10" w16cid:durableId="610164435">
+    <w:abstractNumId w:val="0"/>
   </w:num>
 </w:numbering>
 </file>

</xml_diff>

<commit_message>
Usunięcie zmian spoza zakresu kontroli przed publikacją
</commit_message>
<xml_diff>
--- a/documentation/docs/zaopatrzenie/zasady-oceny-ofert/zasady-oceny-ofert-szablon-wymagan.docx
+++ b/documentation/docs/zaopatrzenie/zasady-oceny-ofert/zasady-oceny-ofert-szablon-wymagan.docx
@@ -134,10 +134,7 @@
           <w:numId w:val="9"/>
         </w:numPr>
         <w:spacing w:before="400"/>
-        <w:ind w:left="357" w:hanging="357"/>
-        <w:rPr>
-          <w:rStyle w:val="Pogrubienie"/>
-        </w:rPr>
+        <w:ind w:hanging="357"/>
       </w:pPr>
       <w:r>
         <w:rPr>
@@ -150,116 +147,82 @@
         <w:rPr>
           <w:rStyle w:val="Pogrubienie"/>
         </w:rPr>
-        <w:t xml:space="preserve">. Dostawca opisze, w jaki sposób zapewni, że oferowane rozwiązanie będzie spełniać i utrzymywać zgodność z kryteriami sukcesu WCAG ujętymi w </w:t>
-      </w:r>
-      <w:hyperlink r:id="rId7" w:tgtFrame="_blank" w:history="1">
+        <w:t xml:space="preserve">. Dostawca opisze, </w:t>
+      </w:r>
+      <w:r>
+        <w:rPr>
+          <w:b/>
+          <w:bCs/>
+        </w:rPr>
+        <w:t xml:space="preserve">w jaki sposób zapewni zgodność oferowanego rozwiązania z wymaganiami normy </w:t>
+      </w:r>
+      <w:hyperlink r:id="rId7" w:history="1">
         <w:r>
           <w:rPr>
             <w:rStyle w:val="Hipercze"/>
             <w:b/>
             <w:bCs/>
           </w:rPr>
-          <w:t>PN-ETSI EN 301 549</w:t>
+          <w:t>P</w:t>
+        </w:r>
+        <w:r>
+          <w:rPr>
+            <w:rStyle w:val="Hipercze"/>
+            <w:b/>
+            <w:bCs/>
+          </w:rPr>
+          <w:t>N</w:t>
+        </w:r>
+        <w:r>
+          <w:rPr>
+            <w:rStyle w:val="Hipercze"/>
+            <w:b/>
+            <w:bCs/>
+          </w:rPr>
+          <w:t>-</w:t>
+        </w:r>
+        <w:r>
+          <w:rPr>
+            <w:rStyle w:val="Hipercze"/>
+            <w:b/>
+            <w:bCs/>
+          </w:rPr>
+          <w:t xml:space="preserve">ETSI </w:t>
+        </w:r>
+        <w:r>
+          <w:rPr>
+            <w:rStyle w:val="Hipercze"/>
+            <w:b/>
+            <w:bCs/>
+          </w:rPr>
+          <w:t xml:space="preserve">EN </w:t>
+        </w:r>
+        <w:r>
+          <w:rPr>
+            <w:rStyle w:val="Hipercze"/>
+            <w:b/>
+            <w:bCs/>
+          </w:rPr>
+          <w:t>301 549</w:t>
         </w:r>
       </w:hyperlink>
       <w:r>
+        <w:rPr>
+          <w:rStyle w:val="Pogrubienie"/>
+          <w:b w:val="0"/>
+          <w:bCs w:val="0"/>
+        </w:rPr>
         <w:t xml:space="preserve"> </w:t>
       </w:r>
       <w:r>
         <w:rPr>
-          <w:rStyle w:val="Pogrubienie"/>
-        </w:rPr>
-        <w:t>zgodnie z przepis</w:t>
-      </w:r>
-      <w:r>
-        <w:rPr>
-          <w:rStyle w:val="Pogrubienie"/>
-        </w:rPr>
-        <w:t>ami</w:t>
-      </w:r>
-      <w:r>
-        <w:rPr>
-          <w:rStyle w:val="Pogrubienie"/>
-        </w:rPr>
-        <w:t xml:space="preserve"> ustawy o dostępności cyfrowej... </w:t>
-      </w:r>
-      <w:r>
-        <w:rPr>
-          <w:rStyle w:val="Pogrubienie"/>
-        </w:rPr>
-        <w:t xml:space="preserve">oraz wymaganiami wykraczającymi ponad ujęte w </w:t>
-      </w:r>
-      <w:r>
-        <w:rPr>
-          <w:rStyle w:val="Pogrubienie"/>
-        </w:rPr>
-        <w:t>PN</w:t>
-      </w:r>
-      <w:r>
-        <w:rPr>
-          <w:rStyle w:val="Pogrubienie"/>
-        </w:rPr>
-        <w:t>-</w:t>
-      </w:r>
-      <w:r>
-        <w:rPr>
-          <w:rStyle w:val="Pogrubienie"/>
-        </w:rPr>
-        <w:t xml:space="preserve">ETSI </w:t>
-      </w:r>
-      <w:r>
-        <w:rPr>
-          <w:rStyle w:val="Pogrubienie"/>
-        </w:rPr>
-        <w:t xml:space="preserve">EN </w:t>
-      </w:r>
-      <w:r>
-        <w:rPr>
-          <w:rStyle w:val="Pogrubienie"/>
-        </w:rPr>
-        <w:t xml:space="preserve">301 549 (np. </w:t>
-      </w:r>
-      <w:r>
-        <w:rPr>
-          <w:rStyle w:val="Pogrubienie"/>
-        </w:rPr>
-        <w:t>niektóre kryteria sukcesu</w:t>
-      </w:r>
-      <w:r>
-        <w:rPr>
-          <w:rStyle w:val="Pogrubienie"/>
-        </w:rPr>
-        <w:t xml:space="preserve"> na</w:t>
-      </w:r>
-      <w:r>
-        <w:rPr>
-          <w:rStyle w:val="Pogrubienie"/>
-        </w:rPr>
-        <w:t> </w:t>
-      </w:r>
-      <w:r>
-        <w:rPr>
-          <w:rStyle w:val="Pogrubienie"/>
-        </w:rPr>
-        <w:t>poziomie WCAG AAA</w:t>
-      </w:r>
-      <w:r>
-        <w:rPr>
-          <w:rStyle w:val="Pogrubienie"/>
-        </w:rPr>
-        <w:t>, dobre praktyki</w:t>
-      </w:r>
-      <w:r>
-        <w:rPr>
-          <w:rStyle w:val="Pogrubienie"/>
-        </w:rPr>
-        <w:t>)</w:t>
-      </w:r>
-      <w:r>
-        <w:rPr>
-          <w:rStyle w:val="Pogrubienie"/>
-        </w:rPr>
-        <w:t xml:space="preserve">. </w:t>
+          <w:b/>
+          <w:bCs/>
+        </w:rPr>
+        <w:t>oraz utrzymanie tej zgodności w całym cyklu życia rozwiązania</w:t>
+      </w:r>
+      <w:r>
+        <w:t>.</w:t>
       </w:r>
     </w:p>
     <w:p>
@@ -350,25 +313,28 @@
           <w:rStyle w:val="Pogrubienie"/>
           <w:color w:val="215E99" w:themeColor="text2" w:themeTint="BF"/>
         </w:rPr>
-        <w:t>W-02. Dostosowanie</w:t>
-      </w:r>
-      <w:r>
-        <w:t xml:space="preserve">. </w:t>
-      </w:r>
-      <w:r>
-        <w:rPr>
-          <w:rStyle w:val="Pogrubienie"/>
-        </w:rPr>
-        <w:t>Dostawca opisze możliwości dostosowania przez nabywcę motywów, graficznego interfejsu użytkownika i funkcjonalności</w:t>
-      </w:r>
-      <w:r>
-        <w:rPr>
-          <w:rStyle w:val="Pogrubienie"/>
-        </w:rPr>
+        <w:t>W-02. Wymagania dodatkowe</w:t>
+      </w:r>
+      <w:r>
+        <w:rPr>
+          <w:rStyle w:val="Pogrubienie"/>
+        </w:rPr>
+        <w:t>. Dodatkowe wymagania mogą obejmować w</w:t>
+      </w:r>
+      <w:r>
+        <w:rPr>
+          <w:rStyle w:val="Pogrubienie"/>
+        </w:rPr>
+        <w:t> </w:t>
+      </w:r>
+      <w:r>
+        <w:rPr>
+          <w:rStyle w:val="Pogrubienie"/>
+        </w:rPr>
+        <w:t>szczególności wybrane kryteria sukcesu WCAG na poziomie AAA oraz inne wymagania określone przez nabywcę</w:t>
+      </w:r>
+      <w:r>
         <w:t>.</w:t>
-      </w:r>
-      <w:r>
-        <w:t xml:space="preserve"> </w:t>
       </w:r>
     </w:p>
     <w:p>
@@ -377,22 +343,7 @@
         <w:ind w:left="360"/>
       </w:pPr>
       <w:r>
-        <w:t>Dostawca określi, jaki wpływ na zgodność z wymogami dostępności mogą mieć dostosowania oraz w jaki sposób dostawca wspiera nabywcę w sprawdzaniu i</w:t>
-      </w:r>
-      <w:r>
-        <w:t> </w:t>
-      </w:r>
-      <w:r>
-        <w:t xml:space="preserve">łagodzeniu zagrożeń związanych z dostępnością </w:t>
-      </w:r>
-      <w:r>
-        <w:t xml:space="preserve">dostosowań </w:t>
-      </w:r>
-      <w:r>
-        <w:t>wprowadzanych podczas procesu wdrażania</w:t>
-      </w:r>
-      <w:r>
-        <w:t xml:space="preserve">. </w:t>
+        <w:t>Dostawca opisze sposób spełnienia dodatkowych wymagań dostępności określonych w dokumentacji zamówienia oraz przedstawi informacje lub dowody potwierdzające możliwość ich spełnienia.</w:t>
       </w:r>
     </w:p>
     <w:p>
@@ -401,37 +352,7 @@
         <w:ind w:left="360"/>
       </w:pPr>
       <w:r>
-        <w:t>Na przykład, czy dostawca przechowuje wytyczne dotyczące sposobu wdrażania zmian w graficznym interfejsie użytkownika lub motywie, aby zachować wymagania dotyczące kolorów lub powiększenia</w:t>
-      </w:r>
-      <w:r>
-        <w:t>.</w:t>
-      </w:r>
-      <w:r>
-        <w:t xml:space="preserve"> </w:t>
-      </w:r>
-      <w:r>
-        <w:t>A</w:t>
-      </w:r>
-      <w:r>
-        <w:t>lbo czy dostawca przechowuje listę</w:t>
-      </w:r>
-      <w:r>
-        <w:t xml:space="preserve"> użytych</w:t>
-      </w:r>
-      <w:r>
-        <w:t xml:space="preserve"> komponentów i ich znane problemy z dostępnością, aby </w:t>
-      </w:r>
-      <w:r>
-        <w:t>nabywca</w:t>
-      </w:r>
-      <w:r>
-        <w:t xml:space="preserve"> m</w:t>
-      </w:r>
-      <w:r>
-        <w:t>ógł</w:t>
-      </w:r>
-      <w:r>
-        <w:t xml:space="preserve"> wybrać przed wdrożeniem tylko dostępne komponenty. </w:t>
+        <w:t>Na przykład może to dotyczyć wybranych kryteriów sukcesu WCAG na poziomie AAA, dodatkowych wymagań dotyczących personalizacji interfejsu użytkownika, rozszerzonego wsparcia technologii wspomagających, wymagań wynikających ze specyfiki usługi lub szczególnych potrzeb użytkowników.</w:t>
       </w:r>
     </w:p>
     <w:p>
@@ -447,7 +368,21 @@
           <w:rStyle w:val="Pogrubienie"/>
           <w:color w:val="215E99" w:themeColor="text2" w:themeTint="BF"/>
         </w:rPr>
-        <w:t>W-03. Tworzenie treści</w:t>
+        <w:t>W-0</w:t>
+      </w:r>
+      <w:r>
+        <w:rPr>
+          <w:rStyle w:val="Pogrubienie"/>
+          <w:color w:val="215E99" w:themeColor="text2" w:themeTint="BF"/>
+        </w:rPr>
+        <w:t>3</w:t>
+      </w:r>
+      <w:r>
+        <w:rPr>
+          <w:rStyle w:val="Pogrubienie"/>
+          <w:color w:val="215E99" w:themeColor="text2" w:themeTint="BF"/>
+        </w:rPr>
+        <w:t>. Dostosowanie</w:t>
       </w:r>
       <w:r>
         <w:t xml:space="preserve">. </w:t>
@@ -456,22 +391,16 @@
         <w:rPr>
           <w:rStyle w:val="Pogrubienie"/>
         </w:rPr>
-        <w:t xml:space="preserve">Dostawca opisze, w jaki sposób rozwiązanie wspiera tworzenie dostępnych treści </w:t>
-      </w:r>
-      <w:r>
-        <w:rPr>
-          <w:rStyle w:val="Pogrubienie"/>
-        </w:rPr>
-        <w:t>cyfrowych</w:t>
-      </w:r>
-      <w:r>
-        <w:rPr>
-          <w:rStyle w:val="Pogrubienie"/>
-        </w:rPr>
-        <w:t xml:space="preserve"> i zapewnia ich zgodność z WCAG</w:t>
-      </w:r>
-      <w:r>
-        <w:t xml:space="preserve">. </w:t>
+        <w:t>Dostawca opisze możliwości dostosowania przez nabywcę motywów, graficznego interfejsu użytkownika i funkcjonalności</w:t>
+      </w:r>
+      <w:r>
+        <w:rPr>
+          <w:rStyle w:val="Pogrubienie"/>
+        </w:rPr>
+        <w:t>.</w:t>
+      </w:r>
+      <w:r>
+        <w:t xml:space="preserve"> </w:t>
       </w:r>
     </w:p>
     <w:p>
@@ -480,19 +409,61 @@
         <w:ind w:left="360"/>
       </w:pPr>
       <w:r>
-        <w:t>Na przykład, czy i jakie mechanizmy</w:t>
+        <w:t>Dostawca określi, jaki wpływ na zgodność z wymogami dostępności mogą mieć dostosowania oraz w jaki sposób dostawca wspiera nabywcę w sprawdzaniu i</w:t>
+      </w:r>
+      <w:r>
+        <w:t> </w:t>
+      </w:r>
+      <w:r>
+        <w:t xml:space="preserve">łagodzeniu zagrożeń związanych z dostępnością </w:t>
+      </w:r>
+      <w:r>
+        <w:t xml:space="preserve">dostosowań </w:t>
+      </w:r>
+      <w:r>
+        <w:t>wprowadzanych podczas procesu wdrażania</w:t>
+      </w:r>
+      <w:r>
+        <w:t xml:space="preserve">. </w:t>
+      </w:r>
+    </w:p>
+    <w:p>
+      <w:pPr>
+        <w:pStyle w:val="Akapitzlist"/>
+        <w:ind w:left="360"/>
+      </w:pPr>
+      <w:r>
+        <w:t>Na przykład, czy dostawca przechowuje wytyczne dotyczące sposobu wdrażania zmian w graficznym interfejsie użytkownika lub motywie, aby zachować wymagania dotyczące kolorów lub powiększenia</w:t>
+      </w:r>
+      <w:r>
+        <w:t>.</w:t>
       </w:r>
       <w:r>
         <w:t xml:space="preserve"> </w:t>
       </w:r>
       <w:r>
-        <w:t xml:space="preserve">lub wskazówki zawiera rozwiązanie, aby pomóc twórcom treści w przesyłaniu lub pisaniu dostępnych treści internetowych, takie jak </w:t>
-      </w:r>
-      <w:r>
-        <w:t>wbudowane</w:t>
-      </w:r>
-      <w:r>
-        <w:t xml:space="preserve"> testy struktury nagłówków, obecności tekstów alternatywnych, itp. </w:t>
+        <w:t>A</w:t>
+      </w:r>
+      <w:r>
+        <w:t>lbo czy dostawca przechowuje listę</w:t>
+      </w:r>
+      <w:r>
+        <w:t xml:space="preserve"> użytych</w:t>
+      </w:r>
+      <w:r>
+        <w:t xml:space="preserve"> komponentów i ich znane problemy z dostępnością, aby </w:t>
+      </w:r>
+      <w:r>
+        <w:t>nabywca</w:t>
+      </w:r>
+      <w:r>
+        <w:t xml:space="preserve"> m</w:t>
+      </w:r>
+      <w:r>
+        <w:t>ógł</w:t>
+      </w:r>
+      <w:r>
+        <w:t xml:space="preserve"> wybrać przed wdrożeniem tylko dostępne komponenty. </w:t>
       </w:r>
     </w:p>
     <w:p>
@@ -502,29 +473,112 @@
           <w:ilvl w:val="0"/>
           <w:numId w:val="9"/>
         </w:numPr>
-        <w:rPr>
-          <w:rStyle w:val="Pogrubienie"/>
-        </w:rPr>
       </w:pPr>
       <w:r>
         <w:rPr>
           <w:rStyle w:val="Pogrubienie"/>
           <w:color w:val="215E99" w:themeColor="text2" w:themeTint="BF"/>
         </w:rPr>
-        <w:t>W-04. Narzędzia dla pracowników</w:t>
-      </w:r>
-      <w:r>
-        <w:rPr>
-          <w:rStyle w:val="Pogrubienie"/>
-        </w:rPr>
-        <w:t xml:space="preserve">. Dostawca opisze, w jaki sposób rozwiązanie wspiera pracowników z niepełnosprawnościami w korzystaniu z narzędzi do </w:t>
-      </w:r>
-      <w:r>
-        <w:rPr>
-          <w:rStyle w:val="Pogrubienie"/>
-        </w:rPr>
         <w:lastRenderedPageBreak/>
-        <w:t>tworzenia treści, zgodnie z wytycznymi ATAG (</w:t>
+        <w:t>W-0</w:t>
+      </w:r>
+      <w:r>
+        <w:rPr>
+          <w:rStyle w:val="Pogrubienie"/>
+          <w:color w:val="215E99" w:themeColor="text2" w:themeTint="BF"/>
+        </w:rPr>
+        <w:t>4</w:t>
+      </w:r>
+      <w:r>
+        <w:rPr>
+          <w:rStyle w:val="Pogrubienie"/>
+          <w:color w:val="215E99" w:themeColor="text2" w:themeTint="BF"/>
+        </w:rPr>
+        <w:t>. Tworzenie treści</w:t>
+      </w:r>
+      <w:r>
+        <w:t xml:space="preserve">. </w:t>
+      </w:r>
+      <w:r>
+        <w:rPr>
+          <w:rStyle w:val="Pogrubienie"/>
+        </w:rPr>
+        <w:t xml:space="preserve">Dostawca opisze, w jaki sposób rozwiązanie wspiera tworzenie dostępnych treści </w:t>
+      </w:r>
+      <w:r>
+        <w:rPr>
+          <w:rStyle w:val="Pogrubienie"/>
+        </w:rPr>
+        <w:t>cyfrowych</w:t>
+      </w:r>
+      <w:r>
+        <w:rPr>
+          <w:rStyle w:val="Pogrubienie"/>
+        </w:rPr>
+        <w:t xml:space="preserve"> i zapewnia ich zgodność z WCAG</w:t>
+      </w:r>
+      <w:r>
+        <w:t xml:space="preserve">. </w:t>
+      </w:r>
+    </w:p>
+    <w:p>
+      <w:pPr>
+        <w:pStyle w:val="Akapitzlist"/>
+        <w:ind w:left="360"/>
+      </w:pPr>
+      <w:r>
+        <w:t>Na przykład, czy i jakie mechanizmy</w:t>
+      </w:r>
+      <w:r>
+        <w:t xml:space="preserve"> </w:t>
+      </w:r>
+      <w:r>
+        <w:t xml:space="preserve">lub wskazówki zawiera rozwiązanie, aby pomóc twórcom treści w przesyłaniu lub pisaniu dostępnych treści internetowych, takie jak </w:t>
+      </w:r>
+      <w:r>
+        <w:t>wbudowane</w:t>
+      </w:r>
+      <w:r>
+        <w:t xml:space="preserve"> testy struktury nagłówków, obecności tekstów alternatywnych, itp. </w:t>
+      </w:r>
+    </w:p>
+    <w:p>
+      <w:pPr>
+        <w:pStyle w:val="Akapitzlist"/>
+        <w:numPr>
+          <w:ilvl w:val="0"/>
+          <w:numId w:val="9"/>
+        </w:numPr>
+        <w:rPr>
+          <w:rStyle w:val="Pogrubienie"/>
+        </w:rPr>
+      </w:pPr>
+      <w:r>
+        <w:rPr>
+          <w:rStyle w:val="Pogrubienie"/>
+          <w:color w:val="215E99" w:themeColor="text2" w:themeTint="BF"/>
+        </w:rPr>
+        <w:t>W-0</w:t>
+      </w:r>
+      <w:r>
+        <w:rPr>
+          <w:rStyle w:val="Pogrubienie"/>
+          <w:color w:val="215E99" w:themeColor="text2" w:themeTint="BF"/>
+        </w:rPr>
+        <w:t>5</w:t>
+      </w:r>
+      <w:r>
+        <w:rPr>
+          <w:rStyle w:val="Pogrubienie"/>
+          <w:color w:val="215E99" w:themeColor="text2" w:themeTint="BF"/>
+        </w:rPr>
+        <w:t>. Narzędzia dla pracowników</w:t>
+      </w:r>
+      <w:r>
+        <w:rPr>
+          <w:rStyle w:val="Pogrubienie"/>
+        </w:rPr>
+        <w:t>. Dostawca opisze, w jaki sposób rozwiązanie wspiera pracowników z niepełnosprawnościami w korzystaniu z narzędzi do tworzenia treści, zgodnie z wytycznymi ATAG (</w:t>
       </w:r>
       <w:hyperlink r:id="rId8" w:history="1">
         <w:r>
@@ -533,7 +587,25 @@
             <w:b/>
             <w:bCs/>
           </w:rPr>
-          <w:t>Authoring Tools Accessibility Guidelines 2.0</w:t>
+          <w:t xml:space="preserve">Authoring Tools Accessibility </w:t>
+        </w:r>
+        <w:proofErr w:type="spellStart"/>
+        <w:r>
+          <w:rPr>
+            <w:rStyle w:val="Hipercze"/>
+            <w:b/>
+            <w:bCs/>
+          </w:rPr>
+          <w:t>Guidelines</w:t>
+        </w:r>
+        <w:proofErr w:type="spellEnd"/>
+        <w:r>
+          <w:rPr>
+            <w:rStyle w:val="Hipercze"/>
+            <w:b/>
+            <w:bCs/>
+          </w:rPr>
+          <w:t xml:space="preserve"> 2.0</w:t>
         </w:r>
       </w:hyperlink>
       <w:r>
@@ -583,7 +655,21 @@
           <w:rStyle w:val="Pogrubienie"/>
           <w:color w:val="215E99" w:themeColor="text2" w:themeTint="BF"/>
         </w:rPr>
-        <w:t>W-05. Nakładki</w:t>
+        <w:t>W-0</w:t>
+      </w:r>
+      <w:r>
+        <w:rPr>
+          <w:rStyle w:val="Pogrubienie"/>
+          <w:color w:val="215E99" w:themeColor="text2" w:themeTint="BF"/>
+        </w:rPr>
+        <w:t>6</w:t>
+      </w:r>
+      <w:r>
+        <w:rPr>
+          <w:rStyle w:val="Pogrubienie"/>
+          <w:color w:val="215E99" w:themeColor="text2" w:themeTint="BF"/>
+        </w:rPr>
+        <w:t>. Nakładki</w:t>
       </w:r>
       <w:r>
         <w:t xml:space="preserve">. </w:t>
@@ -595,13 +681,47 @@
         <w:t xml:space="preserve">Dostawca wskaże, czy w dostarczanym rozwiązaniu korzysta lub planuje korzystać z jakichkolwiek produktów dostarczonych przez firmy wymienione w arkuszu </w:t>
       </w:r>
       <w:hyperlink r:id="rId9" w:anchor="main" w:tgtFrame="_blank" w:history="1">
+        <w:proofErr w:type="spellStart"/>
         <w:r>
           <w:rPr>
             <w:rStyle w:val="Pogrubienie"/>
             <w:color w:val="215E99" w:themeColor="text2" w:themeTint="BF"/>
           </w:rPr>
-          <w:t>Overlay Fact Sheet</w:t>
+          <w:t>Overlay</w:t>
         </w:r>
+        <w:proofErr w:type="spellEnd"/>
+        <w:r>
+          <w:rPr>
+            <w:rStyle w:val="Pogrubienie"/>
+            <w:color w:val="215E99" w:themeColor="text2" w:themeTint="BF"/>
+          </w:rPr>
+          <w:t xml:space="preserve"> </w:t>
+        </w:r>
+        <w:proofErr w:type="spellStart"/>
+        <w:r>
+          <w:rPr>
+            <w:rStyle w:val="Pogrubienie"/>
+            <w:color w:val="215E99" w:themeColor="text2" w:themeTint="BF"/>
+          </w:rPr>
+          <w:t>Fact</w:t>
+        </w:r>
+        <w:proofErr w:type="spellEnd"/>
+        <w:r>
+          <w:rPr>
+            <w:rStyle w:val="Pogrubienie"/>
+            <w:color w:val="215E99" w:themeColor="text2" w:themeTint="BF"/>
+          </w:rPr>
+          <w:t xml:space="preserve"> </w:t>
+        </w:r>
+        <w:proofErr w:type="spellStart"/>
+        <w:r>
+          <w:rPr>
+            <w:rStyle w:val="Pogrubienie"/>
+            <w:color w:val="215E99" w:themeColor="text2" w:themeTint="BF"/>
+          </w:rPr>
+          <w:t>Sheet</w:t>
+        </w:r>
+        <w:proofErr w:type="spellEnd"/>
       </w:hyperlink>
       <w:r>
         <w:rPr>
@@ -640,7 +760,23 @@
         <w:t>)</w:t>
       </w:r>
       <w:r>
-        <w:t xml:space="preserve"> Overlay i Underlay, które oferują naprawę problemów z</w:t>
+        <w:t xml:space="preserve"> </w:t>
+      </w:r>
+      <w:proofErr w:type="spellStart"/>
+      <w:r>
+        <w:t>Overlay</w:t>
+      </w:r>
+      <w:proofErr w:type="spellEnd"/>
+      <w:r>
+        <w:t xml:space="preserve"> i </w:t>
+      </w:r>
+      <w:proofErr w:type="spellStart"/>
+      <w:r>
+        <w:t>Underlay</w:t>
+      </w:r>
+      <w:proofErr w:type="spellEnd"/>
+      <w:r>
+        <w:t>, które oferują naprawę problemów z</w:t>
       </w:r>
       <w:r>
         <w:t> </w:t>
@@ -658,7 +794,15 @@
         <w:t>oraz</w:t>
       </w:r>
       <w:r>
-        <w:t xml:space="preserve"> reputacyjne zarówno dla dostawcy, jak i</w:t>
+        <w:t xml:space="preserve"> </w:t>
+      </w:r>
+      <w:proofErr w:type="spellStart"/>
+      <w:r>
+        <w:t>reputacyjne</w:t>
+      </w:r>
+      <w:proofErr w:type="spellEnd"/>
+      <w:r>
+        <w:t xml:space="preserve"> zarówno dla dostawcy, jak i</w:t>
       </w:r>
       <w:r>
         <w:t> </w:t>
@@ -692,7 +836,21 @@
           <w:rStyle w:val="Pogrubienie"/>
           <w:color w:val="215E99" w:themeColor="text2" w:themeTint="BF"/>
         </w:rPr>
-        <w:t>W-06. Deklaracja</w:t>
+        <w:t>W-0</w:t>
+      </w:r>
+      <w:r>
+        <w:rPr>
+          <w:rStyle w:val="Pogrubienie"/>
+          <w:color w:val="215E99" w:themeColor="text2" w:themeTint="BF"/>
+        </w:rPr>
+        <w:t>7</w:t>
+      </w:r>
+      <w:r>
+        <w:rPr>
+          <w:rStyle w:val="Pogrubienie"/>
+          <w:color w:val="215E99" w:themeColor="text2" w:themeTint="BF"/>
+        </w:rPr>
+        <w:t>. Deklaracja</w:t>
       </w:r>
       <w:r>
         <w:rPr>
@@ -750,7 +908,28 @@
           <w:rStyle w:val="Pogrubienie"/>
           <w:color w:val="215E99" w:themeColor="text2" w:themeTint="BF"/>
         </w:rPr>
-        <w:t>W-07. Wskazówki</w:t>
+        <w:t>W-0</w:t>
+      </w:r>
+      <w:r>
+        <w:rPr>
+          <w:rStyle w:val="Pogrubienie"/>
+          <w:color w:val="215E99" w:themeColor="text2" w:themeTint="BF"/>
+        </w:rPr>
+        <w:t>8</w:t>
+      </w:r>
+      <w:r>
+        <w:rPr>
+          <w:rStyle w:val="Pogrubienie"/>
+          <w:color w:val="215E99" w:themeColor="text2" w:themeTint="BF"/>
+        </w:rPr>
+        <w:t xml:space="preserve">. </w:t>
+      </w:r>
+      <w:r>
+        <w:rPr>
+          <w:rStyle w:val="Pogrubienie"/>
+          <w:color w:val="215E99" w:themeColor="text2" w:themeTint="BF"/>
+        </w:rPr>
+        <w:t>Wskazówki dla użytkowników technologii wspomagających</w:t>
       </w:r>
       <w:r>
         <w:rPr>
@@ -850,6 +1029,24 @@
       </w:r>
       <w:r>
         <w:t>. </w:t>
+      </w:r>
+    </w:p>
+    <w:p>
+      <w:pPr>
+        <w:pStyle w:val="Akapitzlist"/>
+        <w:ind w:left="360"/>
+      </w:pPr>
+      <w:r>
+        <w:t>Dostawca opisze, jakie informacje, instrukcje lub materiały pomocnicze są lub będą dostępne dla użytkowników technologii wspomagających oraz w jaki sposób będą one utrzymywane w aktualności.</w:t>
+      </w:r>
+    </w:p>
+    <w:p>
+      <w:pPr>
+        <w:pStyle w:val="Akapitzlist"/>
+        <w:ind w:left="360"/>
+      </w:pPr>
+      <w:r>
+        <w:t>Na przykład mogą to być instrukcje korzystania z rozwiązania przy użyciu czytników ekranu, oprogramowania powiększającego, sterowania głosowego lub innych technologii wspomagających, a także informacje o znanych ograniczeniach dostępności i sposobach ich obejścia.</w:t>
       </w:r>
     </w:p>
     <w:p>
@@ -868,6 +1065,7 @@
           <w:rStyle w:val="Pogrubienie"/>
           <w:color w:val="215E99" w:themeColor="text2" w:themeTint="BF"/>
         </w:rPr>
+        <w:lastRenderedPageBreak/>
         <w:t>W-08. Dokumenty</w:t>
       </w:r>
       <w:r>
@@ -922,8 +1120,110 @@
       </w:r>
     </w:p>
     <w:p>
-      <w:r>
-        <w:t>Wersja 1.0, 20 września 2025</w:t>
+      <w:pPr>
+        <w:pStyle w:val="Akapitzlist"/>
+        <w:numPr>
+          <w:ilvl w:val="0"/>
+          <w:numId w:val="9"/>
+        </w:numPr>
+      </w:pPr>
+      <w:r>
+        <w:rPr>
+          <w:rStyle w:val="Pogrubienie"/>
+          <w:color w:val="215E99" w:themeColor="text2" w:themeTint="BF"/>
+        </w:rPr>
+        <w:t>W-10. Komponenty stron trzecich</w:t>
+      </w:r>
+      <w:r>
+        <w:rPr>
+          <w:rStyle w:val="Pogrubienie"/>
+        </w:rPr>
+        <w:t>. Dostawca opisze dostępność komponentów i usług stron trzecich stanowiących część oferowanego rozwiązania oraz sposób zarządzania ryzykiem związanym z ich dostępnością</w:t>
+      </w:r>
+      <w:r>
+        <w:t>.</w:t>
+      </w:r>
+    </w:p>
+    <w:p>
+      <w:pPr>
+        <w:pStyle w:val="Akapitzlist"/>
+        <w:ind w:left="360"/>
+      </w:pPr>
+      <w:r>
+        <w:t xml:space="preserve">Dostawca określi, które elementy rozwiązania są dostarczane przez podmioty trzecie, jaki jest ich wpływ na dostępność całego rozwiązania oraz jakie informacje lub dowody dostępności są dostępne dla tych komponentów. </w:t>
+      </w:r>
+    </w:p>
+    <w:p>
+      <w:pPr>
+        <w:pStyle w:val="Akapitzlist"/>
+        <w:ind w:left="360"/>
+      </w:pPr>
+      <w:r>
+        <w:t>Na przykład mogą to być moduły płatności elektronicznych, podpisu elektronicznego, map, komunikacji wideo, systemów uwierzytelniania, usług chmurowych lub innych usług integrowanych z rozwiązaniem. Dostawca powinien również opisać sposób postępowania w przypadku stwierdzenia problemów dostępności takich komponentów.</w:t>
+      </w:r>
+    </w:p>
+    <w:p>
+      <w:pPr>
+        <w:pStyle w:val="Akapitzlist"/>
+        <w:numPr>
+          <w:ilvl w:val="0"/>
+          <w:numId w:val="9"/>
+        </w:numPr>
+      </w:pPr>
+      <w:r>
+        <w:rPr>
+          <w:rStyle w:val="Pogrubienie"/>
+          <w:color w:val="215E99" w:themeColor="text2" w:themeTint="BF"/>
+        </w:rPr>
+        <w:t>W-11. Utrzymanie dostępności</w:t>
+      </w:r>
+      <w:r>
+        <w:rPr>
+          <w:rStyle w:val="Pogrubienie"/>
+        </w:rPr>
+        <w:t>. Dostawca opisze sposób utrzymywania dostępności rozwiązania po wdrożeniu, w tym proces zgłaszania, analizowania i usuwania problemów dostępności cyfrowej oraz sposób informowania nabywcy o zmianach mających wpływ na dostępność rozwiązania</w:t>
+      </w:r>
+      <w:r>
+        <w:t>.</w:t>
+      </w:r>
+    </w:p>
+    <w:p>
+      <w:pPr>
+        <w:pStyle w:val="Akapitzlist"/>
+        <w:ind w:left="360"/>
+      </w:pPr>
+      <w:r>
+        <w:t xml:space="preserve">Dostawca określi sposób monitorowania dostępności rozwiązania, obsługi zgłoszeń dotyczących problemów dostępności oraz utrzymywania zgodności podczas aktualizacji, rozwoju i utrzymania rozwiązania. </w:t>
+      </w:r>
+    </w:p>
+    <w:p>
+      <w:pPr>
+        <w:pStyle w:val="Akapitzlist"/>
+        <w:ind w:left="360"/>
+      </w:pPr>
+      <w:r>
+        <w:t>Na przykład dostawca może przedstawić procedurę obsługi zgłoszeń, deklarowane czasy reakcji i usuwania błędów dostępności, sposób dokumentowania zmian wpływających na dostępność oraz zakres testów wykonywanych przed wdrożeniem nowych wersji rozwiązania.</w:t>
+      </w:r>
+    </w:p>
+    <w:p/>
+    <w:p>
+      <w:r>
+        <w:t>Wersja 1.</w:t>
+      </w:r>
+      <w:r>
+        <w:t>1</w:t>
+      </w:r>
+      <w:r>
+        <w:t xml:space="preserve">, </w:t>
+      </w:r>
+      <w:r>
+        <w:t>24 czerwca</w:t>
+      </w:r>
+      <w:r>
+        <w:t xml:space="preserve"> 20</w:t>
+      </w:r>
+      <w:r>
+        <w:t>26</w:t>
       </w:r>
       <w:r>
         <w:t xml:space="preserve"> </w:t>
@@ -945,6 +1245,92 @@
 <file path=word/numbering.xml><?xml version="1.0" encoding="utf-8"?>
 <w:numbering xmlns:wpc="http://schemas.microsoft.com/office/word/2010/wordprocessingCanvas" xmlns:cx="http://schemas.microsoft.com/office/drawing/2014/chartex" xmlns:cx1="http://schemas.microsoft.com/office/drawing/2015/9/8/chartex" xmlns:cx2="http://schemas.microsoft.com/office/drawing/2015/10/21/chartex" xmlns:cx3="http://schemas.microsoft.com/office/drawing/2016/5/9/chartex" xmlns:cx4="http://schemas.microsoft.com/office/drawing/2016/5/10/chartex" xmlns:cx5="http://schemas.microsoft.com/office/drawing/2016/5/11/chartex" xmlns:cx6="http://schemas.microsoft.com/office/drawing/2016/5/12/chartex" xmlns:cx7="http://schemas.microsoft.com/office/drawing/2016/5/13/chartex" xmlns:cx8="http://schemas.microsoft.com/office/drawing/2016/5/14/chartex" xmlns:mc="http://schemas.openxmlformats.org/markup-compatibility/2006" xmlns:aink="http://schemas.microsoft.com/office/drawing/2016/ink" xmlns:am3d="http://schemas.microsoft.com/office/drawing/2017/model3d" xmlns:o="urn:schemas-microsoft-com:office:office" xmlns:oel="http://schemas.microsoft.com/office/2019/extlst" xmlns:r="http://schemas.openxmlformats.org/officeDocument/2006/relationships" xmlns:m="http://schemas.openxmlformats.org/officeDocument/2006/math" xmlns:v="urn:schemas-microsoft-com:vml" xmlns:wp14="http://schemas.microsoft.com/office/word/2010/wordprocessingDrawing" xmlns:wp="http://schemas.openxmlformats.org/drawingml/2006/wordprocessingDrawing" xmlns:w10="urn:schemas-microsoft-com:office:word" xmlns:w="http://schemas.openxmlformats.org/wordprocessingml/2006/main" xmlns:w14="http://schemas.microsoft.com/office/word/2010/wordml" xmlns:w15="http://schemas.microsoft.com/office/word/2012/wordml" xmlns:w16cex="http://schemas.microsoft.com/office/word/2018/wordml/cex" xmlns:w16cid="http://schemas.microsoft.com/office/word/2016/wordml/cid" xmlns:w16="http://schemas.microsoft.com/office/word/2018/wordml" xmlns:w16du="http://schemas.microsoft.com/office/word/2023/wordml/word16du" xmlns:w16sdtdh="http://schemas.microsoft.com/office/word/2020/wordml/sdtdatahash" xmlns:w16sdtfl="http://schemas.microsoft.com/office/word/2024/wordml/sdtformatlock" xmlns:w16se="http://schemas.microsoft.com/office/word/2015/wordml/symex" xmlns:wpg="http://schemas.microsoft.com/office/word/2010/wordprocessingGroup" xmlns:wpi="http://schemas.microsoft.com/office/word/2010/wordprocessingInk" xmlns:wne="http://schemas.microsoft.com/office/word/2006/wordml" xmlns:wps="http://schemas.microsoft.com/office/word/2010/wordprocessingShape" mc:Ignorable="w14 w15 w16se w16cid w16 w16cex w16sdtdh w16sdtfl w16du wp14">
   <w:abstractNum w:abstractNumId="0" w15:restartNumberingAfterBreak="0">
+    <w:nsid w:val="02D71BA5"/>
+    <w:multiLevelType w:val="hybridMultilevel"/>
+    <w:tmpl w:val="788C3690"/>
+    <w:lvl w:ilvl="0" w:tplc="0415000F">
+      <w:start w:val="1"/>
+      <w:numFmt w:val="decimal"/>
+      <w:lvlText w:val="%1."/>
+      <w:lvlJc w:val="left"/>
+      <w:pPr>
+        <w:ind w:left="360" w:hanging="360"/>
+      </w:pPr>
+    </w:lvl>
+    <w:lvl w:ilvl="1" w:tplc="04150019" w:tentative="1">
+      <w:start w:val="1"/>
+      <w:numFmt w:val="lowerLetter"/>
+      <w:lvlText w:val="%2."/>
+      <w:lvlJc w:val="left"/>
+      <w:pPr>
+        <w:ind w:left="1080" w:hanging="360"/>
+      </w:pPr>
+    </w:lvl>
+    <w:lvl w:ilvl="2" w:tplc="0415001B" w:tentative="1">
+      <w:start w:val="1"/>
+      <w:numFmt w:val="lowerRoman"/>
+      <w:lvlText w:val="%3."/>
+      <w:lvlJc w:val="right"/>
+      <w:pPr>
+        <w:ind w:left="1800" w:hanging="180"/>
+      </w:pPr>
+    </w:lvl>
+    <w:lvl w:ilvl="3" w:tplc="0415000F" w:tentative="1">
+      <w:start w:val="1"/>
+      <w:numFmt w:val="decimal"/>
+      <w:lvlText w:val="%4."/>
+      <w:lvlJc w:val="left"/>
+      <w:pPr>
+        <w:ind w:left="2520" w:hanging="360"/>
+      </w:pPr>
+    </w:lvl>
+    <w:lvl w:ilvl="4" w:tplc="04150019" w:tentative="1">
+      <w:start w:val="1"/>
+      <w:numFmt w:val="lowerLetter"/>
+      <w:lvlText w:val="%5."/>
+      <w:lvlJc w:val="left"/>
+      <w:pPr>
+        <w:ind w:left="3240" w:hanging="360"/>
+      </w:pPr>
+    </w:lvl>
+    <w:lvl w:ilvl="5" w:tplc="0415001B" w:tentative="1">
+      <w:start w:val="1"/>
+      <w:numFmt w:val="lowerRoman"/>
+      <w:lvlText w:val="%6."/>
+      <w:lvlJc w:val="right"/>
+      <w:pPr>
+        <w:ind w:left="3960" w:hanging="180"/>
+      </w:pPr>
+    </w:lvl>
+    <w:lvl w:ilvl="6" w:tplc="0415000F" w:tentative="1">
+      <w:start w:val="1"/>
+      <w:numFmt w:val="decimal"/>
+      <w:lvlText w:val="%7."/>
+      <w:lvlJc w:val="left"/>
+      <w:pPr>
+        <w:ind w:left="4680" w:hanging="360"/>
+      </w:pPr>
+    </w:lvl>
+    <w:lvl w:ilvl="7" w:tplc="04150019" w:tentative="1">
+      <w:start w:val="1"/>
+      <w:numFmt w:val="lowerLetter"/>
+      <w:lvlText w:val="%8."/>
+      <w:lvlJc w:val="left"/>
+      <w:pPr>
+        <w:ind w:left="5400" w:hanging="360"/>
+      </w:pPr>
+    </w:lvl>
+    <w:lvl w:ilvl="8" w:tplc="0415001B" w:tentative="1">
+      <w:start w:val="1"/>
+      <w:numFmt w:val="lowerRoman"/>
+      <w:lvlText w:val="%9."/>
+      <w:lvlJc w:val="right"/>
+      <w:pPr>
+        <w:ind w:left="6120" w:hanging="180"/>
+      </w:pPr>
+    </w:lvl>
+  </w:abstractNum>
+  <w:abstractNum w:abstractNumId="1" w15:restartNumberingAfterBreak="0">
     <w:nsid w:val="13901F6F"/>
     <w:multiLevelType w:val="multilevel"/>
     <w:tmpl w:val="58FE7744"/>
@@ -1057,7 +1443,7 @@
       </w:pPr>
     </w:lvl>
   </w:abstractNum>
-  <w:abstractNum w:abstractNumId="1" w15:restartNumberingAfterBreak="0">
+  <w:abstractNum w:abstractNumId="2" w15:restartNumberingAfterBreak="0">
     <w:nsid w:val="22D91A2D"/>
     <w:multiLevelType w:val="multilevel"/>
     <w:tmpl w:val="F2006D6C"/>
@@ -1170,7 +1556,7 @@
       </w:pPr>
     </w:lvl>
   </w:abstractNum>
-  <w:abstractNum w:abstractNumId="2" w15:restartNumberingAfterBreak="0">
+  <w:abstractNum w:abstractNumId="3" w15:restartNumberingAfterBreak="0">
     <w:nsid w:val="43537B60"/>
     <w:multiLevelType w:val="multilevel"/>
     <w:tmpl w:val="C0A06BE4"/>
@@ -1283,7 +1669,7 @@
       </w:pPr>
     </w:lvl>
   </w:abstractNum>
-  <w:abstractNum w:abstractNumId="3" w15:restartNumberingAfterBreak="0">
+  <w:abstractNum w:abstractNumId="4" w15:restartNumberingAfterBreak="0">
     <w:nsid w:val="519217A8"/>
     <w:multiLevelType w:val="multilevel"/>
     <w:tmpl w:val="75F2308C"/>
@@ -1396,7 +1782,7 @@
       </w:pPr>
     </w:lvl>
   </w:abstractNum>
-  <w:abstractNum w:abstractNumId="4" w15:restartNumberingAfterBreak="0">
+  <w:abstractNum w:abstractNumId="5" w15:restartNumberingAfterBreak="0">
     <w:nsid w:val="5EAA689A"/>
     <w:multiLevelType w:val="multilevel"/>
     <w:tmpl w:val="3C6C7E76"/>
@@ -1509,7 +1895,7 @@
       </w:pPr>
     </w:lvl>
   </w:abstractNum>
-  <w:abstractNum w:abstractNumId="5" w15:restartNumberingAfterBreak="0">
+  <w:abstractNum w:abstractNumId="6" w15:restartNumberingAfterBreak="0">
     <w:nsid w:val="5EAE16CC"/>
     <w:multiLevelType w:val="multilevel"/>
     <w:tmpl w:val="945C1710"/>
@@ -1622,7 +2008,7 @@
       </w:pPr>
     </w:lvl>
   </w:abstractNum>
-  <w:abstractNum w:abstractNumId="6" w15:restartNumberingAfterBreak="0">
+  <w:abstractNum w:abstractNumId="7" w15:restartNumberingAfterBreak="0">
     <w:nsid w:val="62CA2B42"/>
     <w:multiLevelType w:val="multilevel"/>
     <w:tmpl w:val="9F7CD062"/>
@@ -1735,7 +2121,7 @@
       </w:rPr>
     </w:lvl>
   </w:abstractNum>
-  <w:abstractNum w:abstractNumId="7" w15:restartNumberingAfterBreak="0">
+  <w:abstractNum w:abstractNumId="8" w15:restartNumberingAfterBreak="0">
     <w:nsid w:val="6F6844F9"/>
     <w:multiLevelType w:val="multilevel"/>
     <w:tmpl w:val="8AF69BA8"/>
@@ -1848,7 +2234,7 @@
       </w:pPr>
     </w:lvl>
   </w:abstractNum>
-  <w:abstractNum w:abstractNumId="8" w15:restartNumberingAfterBreak="0">
+  <w:abstractNum w:abstractNumId="9" w15:restartNumberingAfterBreak="0">
     <w:nsid w:val="7A206213"/>
     <w:multiLevelType w:val="multilevel"/>
     <w:tmpl w:val="68FAB0D6"/>
@@ -1962,31 +2348,34 @@
     </w:lvl>
   </w:abstractNum>
   <w:num w:numId="1" w16cid:durableId="1733892192">
+    <w:abstractNumId w:val="4"/>
+  </w:num>
+  <w:num w:numId="2" w16cid:durableId="82067894">
+    <w:abstractNumId w:val="5"/>
+  </w:num>
+  <w:num w:numId="3" w16cid:durableId="294410836">
+    <w:abstractNumId w:val="2"/>
+  </w:num>
+  <w:num w:numId="4" w16cid:durableId="2139759483">
+    <w:abstractNumId w:val="1"/>
+  </w:num>
+  <w:num w:numId="5" w16cid:durableId="2082173405">
+    <w:abstractNumId w:val="8"/>
+  </w:num>
+  <w:num w:numId="6" w16cid:durableId="996954802">
+    <w:abstractNumId w:val="9"/>
+  </w:num>
+  <w:num w:numId="7" w16cid:durableId="1252395507">
     <w:abstractNumId w:val="3"/>
   </w:num>
-  <w:num w:numId="2" w16cid:durableId="82067894">
-    <w:abstractNumId w:val="4"/>
+  <w:num w:numId="8" w16cid:durableId="554313028">
+    <w:abstractNumId w:val="6"/>
   </w:num>
-  <w:num w:numId="3" w16cid:durableId="294410836">
-    <w:abstractNumId w:val="1"/>
-  </w:num>
-  <w:num w:numId="4" w16cid:durableId="2139759483">
-    <w:abstractNumId w:val="0"/>
-  </w:num>
-  <w:num w:numId="5" w16cid:durableId="2082173405">
+  <w:num w:numId="9" w16cid:durableId="1781414407">
     <w:abstractNumId w:val="7"/>
   </w:num>
-  <w:num w:numId="6" w16cid:durableId="996954802">
-    <w:abstractNumId w:val="8"/>
-  </w:num>
-  <w:num w:numId="7" w16cid:durableId="1252395507">
-    <w:abstractNumId w:val="2"/>
-  </w:num>
-  <w:num w:numId="8" w16cid:durableId="554313028">
-    <w:abstractNumId w:val="5"/>
-  </w:num>
-  <w:num w:numId="9" w16cid:durableId="1781414407">
-    <w:abstractNumId w:val="6"/>
+  <w:num w:numId="10" w16cid:durableId="610164435">
+    <w:abstractNumId w:val="0"/>
   </w:num>
 </w:numbering>
 </file>

</xml_diff>